<commit_message>
Procedures: shrink letterhead banner 25% (6.7in -> 5.0in)
Header + footer letterhead banners resized 25% smaller in build_procedure.py and
rebrand_procedures.py for better proportion / more content room. Regenerated the
8 templated procedures and re-rebranded the 29 legacy ones. Backup guard added so
re-runs never overwrite the true pre-brand originals.

Co-Authored-By: Claude Opus 4.8 <noreply@anthropic.com>
</commit_message>
<xml_diff>
--- a/process-library/01-quality-as9100/EXOS-US-QMS-001_Process_and_Procedure_Control.docx
+++ b/process-library/01-quality-as9100/EXOS-US-QMS-001_Process_and_Procedure_Control.docx
@@ -437,7 +437,7 @@
     <w:r>
       <w:drawing>
         <wp:inline xmlns:a="http://schemas.openxmlformats.org/drawingml/2006/main" xmlns:pic="http://schemas.openxmlformats.org/drawingml/2006/picture">
-          <wp:extent cx="6126480" cy="1005910"/>
+          <wp:extent cx="4572000" cy="750679"/>
           <wp:docPr id="1" name="Picture 1"/>
           <wp:cNvGraphicFramePr>
             <a:graphicFrameLocks noChangeAspect="1"/>
@@ -446,7 +446,7 @@
             <a:graphicData uri="http://schemas.openxmlformats.org/drawingml/2006/picture">
               <pic:pic>
                 <pic:nvPicPr>
-                  <pic:cNvPr id="0" name="exos-letterhead-footer.png"/>
+                  <pic:cNvPr id="0" name="image.png"/>
                   <pic:cNvPicPr/>
                 </pic:nvPicPr>
                 <pic:blipFill>
@@ -458,7 +458,7 @@
                 <pic:spPr>
                   <a:xfrm>
                     <a:off x="0" y="0"/>
-                    <a:ext cx="6126480" cy="1005910"/>
+                    <a:ext cx="4572000" cy="750679"/>
                   </a:xfrm>
                   <a:prstGeom prst="rect"/>
                 </pic:spPr>
@@ -482,7 +482,7 @@
     <w:r>
       <w:drawing>
         <wp:inline xmlns:a="http://schemas.openxmlformats.org/drawingml/2006/main" xmlns:pic="http://schemas.openxmlformats.org/drawingml/2006/picture">
-          <wp:extent cx="6126480" cy="1264972"/>
+          <wp:extent cx="4572000" cy="944009"/>
           <wp:docPr id="1" name="Picture 1"/>
           <wp:cNvGraphicFramePr>
             <a:graphicFrameLocks noChangeAspect="1"/>
@@ -491,7 +491,7 @@
             <a:graphicData uri="http://schemas.openxmlformats.org/drawingml/2006/picture">
               <pic:pic>
                 <pic:nvPicPr>
-                  <pic:cNvPr id="0" name="exos-letterhead-header.png"/>
+                  <pic:cNvPr id="0" name="image.png"/>
                   <pic:cNvPicPr/>
                 </pic:nvPicPr>
                 <pic:blipFill>
@@ -503,7 +503,7 @@
                 <pic:spPr>
                   <a:xfrm>
                     <a:off x="0" y="0"/>
-                    <a:ext cx="6126480" cy="1264972"/>
+                    <a:ext cx="4572000" cy="944009"/>
                   </a:xfrm>
                   <a:prstGeom prst="rect"/>
                 </pic:spPr>

</xml_diff>

<commit_message>
Procedures: move letterhead banner into the body (fix off-page header/footer)
Word headers/footers sat in the margin and bled off the top/bottom page edges (and
are dropped entirely by the textutil docx->pdf path). Moved the letterhead header
banner to the top of the body and the footer banner + controlled-doc line to the
bottom, so branding renders cleanly on-page in Word/Preview. Regenerated all 37
procedures; rebrand now restores from the pristine backup each run (no banner
accumulation).

Co-Authored-By: Claude Opus 4.8 <noreply@anthropic.com>
</commit_message>
<xml_diff>
--- a/process-library/01-quality-as9100/EXOS-US-QMS-001_Process_and_Procedure_Control.docx
+++ b/process-library/01-quality-as9100/EXOS-US-QMS-001_Process_and_Procedure_Control.docx
@@ -2,6 +2,46 @@
 <file path=word/document.xml><?xml version="1.0" encoding="utf-8"?>
 <w:document xmlns:wpc="http://schemas.microsoft.com/office/word/2010/wordprocessingCanvas" xmlns:mo="http://schemas.microsoft.com/office/mac/office/2008/main" xmlns:mc="http://schemas.openxmlformats.org/markup-compatibility/2006" xmlns:mv="urn:schemas-microsoft-com:mac:vml" xmlns:o="urn:schemas-microsoft-com:office:office" xmlns:r="http://schemas.openxmlformats.org/officeDocument/2006/relationships" xmlns:m="http://schemas.openxmlformats.org/officeDocument/2006/math" xmlns:v="urn:schemas-microsoft-com:vml" xmlns:wp14="http://schemas.microsoft.com/office/word/2010/wordprocessingDrawing" xmlns:wp="http://schemas.openxmlformats.org/drawingml/2006/wordprocessingDrawing" xmlns:w10="urn:schemas-microsoft-com:office:word" xmlns:w="http://schemas.openxmlformats.org/wordprocessingml/2006/main" xmlns:w14="http://schemas.microsoft.com/office/word/2010/wordml" xmlns:wpg="http://schemas.microsoft.com/office/word/2010/wordprocessingGroup" xmlns:wpi="http://schemas.microsoft.com/office/word/2010/wordprocessingInk" xmlns:wne="http://schemas.microsoft.com/office/word/2006/wordml" xmlns:wps="http://schemas.microsoft.com/office/word/2010/wordprocessingShape" mc:Ignorable="w14 wp14">
   <w:body>
+    <w:p>
+      <w:pPr>
+        <w:spacing w:after="120"/>
+        <w:jc w:val="center"/>
+      </w:pPr>
+      <w:r>
+        <w:drawing>
+          <wp:inline xmlns:a="http://schemas.openxmlformats.org/drawingml/2006/main" xmlns:pic="http://schemas.openxmlformats.org/drawingml/2006/picture">
+            <wp:extent cx="4572000" cy="944009"/>
+            <wp:docPr id="1" name="Picture 1"/>
+            <wp:cNvGraphicFramePr>
+              <a:graphicFrameLocks noChangeAspect="1"/>
+            </wp:cNvGraphicFramePr>
+            <a:graphic>
+              <a:graphicData uri="http://schemas.openxmlformats.org/drawingml/2006/picture">
+                <pic:pic>
+                  <pic:nvPicPr>
+                    <pic:cNvPr id="0" name="exos-letterhead-header.png"/>
+                    <pic:cNvPicPr/>
+                  </pic:nvPicPr>
+                  <pic:blipFill>
+                    <a:blip r:embed="rId11"/>
+                    <a:stretch>
+                      <a:fillRect/>
+                    </a:stretch>
+                  </pic:blipFill>
+                  <pic:spPr>
+                    <a:xfrm>
+                      <a:off x="0" y="0"/>
+                      <a:ext cx="4572000" cy="944009"/>
+                    </a:xfrm>
+                    <a:prstGeom prst="rect"/>
+                  </pic:spPr>
+                </pic:pic>
+              </a:graphicData>
+            </a:graphic>
+          </wp:inline>
+        </w:drawing>
+      </w:r>
+    </w:p>
     <w:p>
       <w:pPr>
         <w:spacing w:after="20" w:before="0"/>
@@ -415,11 +455,51 @@
         <w:t>Exos Aerospace Systems &amp; Technologies, Inc.  ·  PROPRIETARY  ·  File: Mission Control → Procedures</w:t>
       </w:r>
     </w:p>
+    <w:p>
+      <w:pPr>
+        <w:spacing w:before="200"/>
+        <w:jc w:val="center"/>
+      </w:pPr>
+      <w:r>
+        <w:drawing>
+          <wp:inline xmlns:a="http://schemas.openxmlformats.org/drawingml/2006/main" xmlns:pic="http://schemas.openxmlformats.org/drawingml/2006/picture">
+            <wp:extent cx="4572000" cy="750679"/>
+            <wp:docPr id="2" name="Picture 2"/>
+            <wp:cNvGraphicFramePr>
+              <a:graphicFrameLocks noChangeAspect="1"/>
+            </wp:cNvGraphicFramePr>
+            <a:graphic>
+              <a:graphicData uri="http://schemas.openxmlformats.org/drawingml/2006/picture">
+                <pic:pic>
+                  <pic:nvPicPr>
+                    <pic:cNvPr id="0" name="exos-letterhead-footer.png"/>
+                    <pic:cNvPicPr/>
+                  </pic:nvPicPr>
+                  <pic:blipFill>
+                    <a:blip r:embed="rId12"/>
+                    <a:stretch>
+                      <a:fillRect/>
+                    </a:stretch>
+                  </pic:blipFill>
+                  <pic:spPr>
+                    <a:xfrm>
+                      <a:off x="0" y="0"/>
+                      <a:ext cx="4572000" cy="750679"/>
+                    </a:xfrm>
+                    <a:prstGeom prst="rect"/>
+                  </pic:spPr>
+                </pic:pic>
+              </a:graphicData>
+            </a:graphic>
+          </wp:inline>
+        </w:drawing>
+      </w:r>
+    </w:p>
     <w:sectPr>
       <w:headerReference w:type="default" r:id="rId9"/>
       <w:footerReference w:type="default" r:id="rId10"/>
       <w:pgSz w:w="12240" w:h="15840"/>
-      <w:pgMar w:top="720" w:right="1152" w:bottom="792" w:left="1152" w:header="432" w:footer="360" w:gutter="0"/>
+      <w:pgMar w:top="864" w:right="1152" w:bottom="864" w:left="1152" w:header="720" w:footer="720" w:gutter="0"/>
       <w:cols w:space="720"/>
       <w:docGrid w:linePitch="360"/>
     </w:sectPr>
@@ -432,42 +512,7 @@
   <w:p>
     <w:pPr>
       <w:pStyle w:val="Footer"/>
-      <w:jc w:val="center"/>
-    </w:pPr>
-    <w:r>
-      <w:drawing>
-        <wp:inline xmlns:a="http://schemas.openxmlformats.org/drawingml/2006/main" xmlns:pic="http://schemas.openxmlformats.org/drawingml/2006/picture">
-          <wp:extent cx="4572000" cy="750679"/>
-          <wp:docPr id="1" name="Picture 1"/>
-          <wp:cNvGraphicFramePr>
-            <a:graphicFrameLocks noChangeAspect="1"/>
-          </wp:cNvGraphicFramePr>
-          <a:graphic>
-            <a:graphicData uri="http://schemas.openxmlformats.org/drawingml/2006/picture">
-              <pic:pic>
-                <pic:nvPicPr>
-                  <pic:cNvPr id="0" name="image.png"/>
-                  <pic:cNvPicPr/>
-                </pic:nvPicPr>
-                <pic:blipFill>
-                  <a:blip r:embed="rId1"/>
-                  <a:stretch>
-                    <a:fillRect/>
-                  </a:stretch>
-                </pic:blipFill>
-                <pic:spPr>
-                  <a:xfrm>
-                    <a:off x="0" y="0"/>
-                    <a:ext cx="4572000" cy="750679"/>
-                  </a:xfrm>
-                  <a:prstGeom prst="rect"/>
-                </pic:spPr>
-              </pic:pic>
-            </a:graphicData>
-          </a:graphic>
-        </wp:inline>
-      </w:drawing>
-    </w:r>
+    </w:pPr>
   </w:p>
 </w:ftr>
 </file>
@@ -477,42 +522,7 @@
   <w:p>
     <w:pPr>
       <w:pStyle w:val="Header"/>
-      <w:jc w:val="center"/>
-    </w:pPr>
-    <w:r>
-      <w:drawing>
-        <wp:inline xmlns:a="http://schemas.openxmlformats.org/drawingml/2006/main" xmlns:pic="http://schemas.openxmlformats.org/drawingml/2006/picture">
-          <wp:extent cx="4572000" cy="944009"/>
-          <wp:docPr id="1" name="Picture 1"/>
-          <wp:cNvGraphicFramePr>
-            <a:graphicFrameLocks noChangeAspect="1"/>
-          </wp:cNvGraphicFramePr>
-          <a:graphic>
-            <a:graphicData uri="http://schemas.openxmlformats.org/drawingml/2006/picture">
-              <pic:pic>
-                <pic:nvPicPr>
-                  <pic:cNvPr id="0" name="image.png"/>
-                  <pic:cNvPicPr/>
-                </pic:nvPicPr>
-                <pic:blipFill>
-                  <a:blip r:embed="rId1"/>
-                  <a:stretch>
-                    <a:fillRect/>
-                  </a:stretch>
-                </pic:blipFill>
-                <pic:spPr>
-                  <a:xfrm>
-                    <a:off x="0" y="0"/>
-                    <a:ext cx="4572000" cy="944009"/>
-                  </a:xfrm>
-                  <a:prstGeom prst="rect"/>
-                </pic:spPr>
-              </pic:pic>
-            </a:graphicData>
-          </a:graphic>
-        </wp:inline>
-      </w:drawing>
-    </w:r>
+    </w:pPr>
   </w:p>
 </w:hdr>
 </file>

</xml_diff>